<commit_message>
HW2: updated docx file
</commit_message>
<xml_diff>
--- a/HW2/Nisarg_Patel_HW2.docx
+++ b/HW2/Nisarg_Patel_HW2.docx
@@ -2068,12 +2068,12 @@
           <wp:inline distB="114300" distT="114300" distL="114300" distR="114300">
             <wp:extent cx="5943600" cy="2895600"/>
             <wp:effectExtent b="0" l="0" r="0" t="0"/>
-            <wp:docPr id="5" name="image3.png"/>
+            <wp:docPr id="5" name="image7.png"/>
             <a:graphic>
               <a:graphicData uri="http://schemas.openxmlformats.org/drawingml/2006/picture">
                 <pic:pic>
                   <pic:nvPicPr>
-                    <pic:cNvPr id="0" name="image3.png"/>
+                    <pic:cNvPr id="0" name="image7.png"/>
                     <pic:cNvPicPr preferRelativeResize="0"/>
                   </pic:nvPicPr>
                   <pic:blipFill>
@@ -2122,12 +2122,12 @@
           <wp:inline distB="114300" distT="114300" distL="114300" distR="114300">
             <wp:extent cx="5943600" cy="2171700"/>
             <wp:effectExtent b="0" l="0" r="0" t="0"/>
-            <wp:docPr id="6" name="image5.png"/>
+            <wp:docPr id="6" name="image4.png"/>
             <a:graphic>
               <a:graphicData uri="http://schemas.openxmlformats.org/drawingml/2006/picture">
                 <pic:pic>
                   <pic:nvPicPr>
-                    <pic:cNvPr id="0" name="image5.png"/>
+                    <pic:cNvPr id="0" name="image4.png"/>
                     <pic:cNvPicPr preferRelativeResize="0"/>
                   </pic:nvPicPr>
                   <pic:blipFill>
@@ -2176,12 +2176,12 @@
           <wp:inline distB="114300" distT="114300" distL="114300" distR="114300">
             <wp:extent cx="5943600" cy="2070100"/>
             <wp:effectExtent b="0" l="0" r="0" t="0"/>
-            <wp:docPr id="9" name="image9.png"/>
+            <wp:docPr id="9" name="image10.png"/>
             <a:graphic>
               <a:graphicData uri="http://schemas.openxmlformats.org/drawingml/2006/picture">
                 <pic:pic>
                   <pic:nvPicPr>
-                    <pic:cNvPr id="0" name="image9.png"/>
+                    <pic:cNvPr id="0" name="image10.png"/>
                     <pic:cNvPicPr preferRelativeResize="0"/>
                   </pic:nvPicPr>
                   <pic:blipFill>
@@ -2230,12 +2230,12 @@
           <wp:inline distB="114300" distT="114300" distL="114300" distR="114300">
             <wp:extent cx="5943600" cy="1816100"/>
             <wp:effectExtent b="0" l="0" r="0" t="0"/>
-            <wp:docPr id="7" name="image4.png"/>
+            <wp:docPr id="7" name="image8.png"/>
             <a:graphic>
               <a:graphicData uri="http://schemas.openxmlformats.org/drawingml/2006/picture">
                 <pic:pic>
                   <pic:nvPicPr>
-                    <pic:cNvPr id="0" name="image4.png"/>
+                    <pic:cNvPr id="0" name="image8.png"/>
                     <pic:cNvPicPr preferRelativeResize="0"/>
                   </pic:nvPicPr>
                   <pic:blipFill>
@@ -2284,12 +2284,12 @@
           <wp:inline distB="114300" distT="114300" distL="114300" distR="114300">
             <wp:extent cx="5943600" cy="4889500"/>
             <wp:effectExtent b="0" l="0" r="0" t="0"/>
-            <wp:docPr id="11" name="image10.png"/>
+            <wp:docPr id="11" name="image11.png"/>
             <a:graphic>
               <a:graphicData uri="http://schemas.openxmlformats.org/drawingml/2006/picture">
                 <pic:pic>
                   <pic:nvPicPr>
-                    <pic:cNvPr id="0" name="image10.png"/>
+                    <pic:cNvPr id="0" name="image11.png"/>
                     <pic:cNvPicPr preferRelativeResize="0"/>
                   </pic:nvPicPr>
                   <pic:blipFill>
@@ -2338,12 +2338,12 @@
           <wp:inline distB="114300" distT="114300" distL="114300" distR="114300">
             <wp:extent cx="5943600" cy="4864100"/>
             <wp:effectExtent b="0" l="0" r="0" t="0"/>
-            <wp:docPr id="8" name="image6.png"/>
+            <wp:docPr id="8" name="image9.png"/>
             <a:graphic>
               <a:graphicData uri="http://schemas.openxmlformats.org/drawingml/2006/picture">
                 <pic:pic>
                   <pic:nvPicPr>
-                    <pic:cNvPr id="0" name="image6.png"/>
+                    <pic:cNvPr id="0" name="image9.png"/>
                     <pic:cNvPicPr preferRelativeResize="0"/>
                   </pic:nvPicPr>
                   <pic:blipFill>
@@ -2392,12 +2392,12 @@
           <wp:inline distB="114300" distT="114300" distL="114300" distR="114300">
             <wp:extent cx="5943600" cy="3949700"/>
             <wp:effectExtent b="0" l="0" r="0" t="0"/>
-            <wp:docPr id="2" name="image11.png"/>
+            <wp:docPr id="2" name="image1.png"/>
             <a:graphic>
               <a:graphicData uri="http://schemas.openxmlformats.org/drawingml/2006/picture">
                 <pic:pic>
                   <pic:nvPicPr>
-                    <pic:cNvPr id="0" name="image11.png"/>
+                    <pic:cNvPr id="0" name="image1.png"/>
                     <pic:cNvPicPr preferRelativeResize="0"/>
                   </pic:nvPicPr>
                   <pic:blipFill>
@@ -2446,12 +2446,12 @@
           <wp:inline distB="114300" distT="114300" distL="114300" distR="114300">
             <wp:extent cx="5943600" cy="3149600"/>
             <wp:effectExtent b="0" l="0" r="0" t="0"/>
-            <wp:docPr id="10" name="image8.png"/>
+            <wp:docPr id="10" name="image6.png"/>
             <a:graphic>
               <a:graphicData uri="http://schemas.openxmlformats.org/drawingml/2006/picture">
                 <pic:pic>
                   <pic:nvPicPr>
-                    <pic:cNvPr id="0" name="image8.png"/>
+                    <pic:cNvPr id="0" name="image6.png"/>
                     <pic:cNvPicPr preferRelativeResize="0"/>
                   </pic:nvPicPr>
                   <pic:blipFill>
@@ -2500,12 +2500,12 @@
           <wp:inline distB="114300" distT="114300" distL="114300" distR="114300">
             <wp:extent cx="5943600" cy="2946400"/>
             <wp:effectExtent b="0" l="0" r="0" t="0"/>
-            <wp:docPr id="3" name="image7.png"/>
+            <wp:docPr id="3" name="image5.png"/>
             <a:graphic>
               <a:graphicData uri="http://schemas.openxmlformats.org/drawingml/2006/picture">
                 <pic:pic>
                   <pic:nvPicPr>
-                    <pic:cNvPr id="0" name="image7.png"/>
+                    <pic:cNvPr id="0" name="image5.png"/>
                     <pic:cNvPicPr preferRelativeResize="0"/>
                   </pic:nvPicPr>
                   <pic:blipFill>
@@ -3659,12 +3659,12 @@
           <wp:inline distB="114300" distT="114300" distL="114300" distR="114300">
             <wp:extent cx="5943600" cy="4368800"/>
             <wp:effectExtent b="0" l="0" r="0" t="0"/>
-            <wp:docPr id="1" name="image1.png"/>
+            <wp:docPr id="1" name="image3.png"/>
             <a:graphic>
               <a:graphicData uri="http://schemas.openxmlformats.org/drawingml/2006/picture">
                 <pic:pic>
                   <pic:nvPicPr>
-                    <pic:cNvPr id="0" name="image1.png"/>
+                    <pic:cNvPr id="0" name="image3.png"/>
                     <pic:cNvPicPr preferRelativeResize="0"/>
                   </pic:nvPicPr>
                   <pic:blipFill>
@@ -3948,6 +3948,76 @@
           <w:rtl w:val="0"/>
         </w:rPr>
         <w:t xml:space="preserve">If we compare all models we can see NB shows highest Accuracy and AUC but Given that the wine-tasting experts seek insights into how the model makes predictions, the Decision Tree model would be the most suitable choice. Decision Trees are highly interpretable, as they create a flowchart-like structure that allows users to see the decision paths and understand how different features contribute to the classification of wine quality. This transparency makes it easier for experts to trust and validate the model's predictions. Alternatively, Logistic Regression could also be considered, as it provides coefficients that show the weight of each feature in the decision-making process, offering a straightforward understanding of how changes in features affect the predictions.</w:t>
+      </w:r>
+    </w:p>
+    <w:p>
+      <w:pPr>
+        <w:ind w:left="720" w:firstLine="0"/>
+        <w:rPr>
+          <w:rFonts w:ascii="Times New Roman" w:cs="Times New Roman" w:eastAsia="Times New Roman" w:hAnsi="Times New Roman"/>
+          <w:sz w:val="20"/>
+          <w:szCs w:val="20"/>
+          <w:highlight w:val="white"/>
+        </w:rPr>
+      </w:pPr>
+      <w:r>
+        <w:rPr>
+          <w:rtl w:val="0"/>
+        </w:rPr>
+      </w:r>
+    </w:p>
+    <w:p>
+      <w:pPr>
+        <w:keepNext w:val="0"/>
+        <w:keepLines w:val="0"/>
+        <w:pageBreakBefore w:val="0"/>
+        <w:widowControl w:val="0"/>
+        <w:pBdr>
+          <w:top w:space="0" w:sz="0" w:val="nil"/>
+          <w:left w:space="0" w:sz="0" w:val="nil"/>
+          <w:bottom w:space="0" w:sz="0" w:val="nil"/>
+          <w:right w:space="0" w:sz="0" w:val="nil"/>
+          <w:between w:space="0" w:sz="0" w:val="nil"/>
+        </w:pBdr>
+        <w:shd w:fill="auto" w:val="clear"/>
+        <w:spacing w:after="240" w:before="0" w:line="227.99999999999997" w:lineRule="auto"/>
+        <w:ind w:left="0" w:right="0" w:firstLine="0"/>
+        <w:jc w:val="left"/>
+        <w:rPr>
+          <w:rFonts w:ascii="Times New Roman" w:cs="Times New Roman" w:eastAsia="Times New Roman" w:hAnsi="Times New Roman"/>
+          <w:sz w:val="24"/>
+          <w:szCs w:val="24"/>
+        </w:rPr>
+      </w:pPr>
+      <w:r>
+        <w:rPr>
+          <w:rFonts w:ascii="Times New Roman" w:cs="Times New Roman" w:eastAsia="Times New Roman" w:hAnsi="Times New Roman"/>
+          <w:sz w:val="24"/>
+          <w:szCs w:val="24"/>
+          <w:rtl w:val="0"/>
+        </w:rPr>
+        <w:t xml:space="preserve">Python file Github link</w:t>
+      </w:r>
+    </w:p>
+    <w:p>
+      <w:pPr>
+        <w:ind w:left="0" w:firstLine="0"/>
+        <w:rPr>
+          <w:rFonts w:ascii="Times New Roman" w:cs="Times New Roman" w:eastAsia="Times New Roman" w:hAnsi="Times New Roman"/>
+          <w:sz w:val="20"/>
+          <w:szCs w:val="20"/>
+          <w:highlight w:val="white"/>
+        </w:rPr>
+      </w:pPr>
+      <w:r>
+        <w:rPr>
+          <w:rFonts w:ascii="Times New Roman" w:cs="Times New Roman" w:eastAsia="Times New Roman" w:hAnsi="Times New Roman"/>
+          <w:sz w:val="20"/>
+          <w:szCs w:val="20"/>
+          <w:highlight w:val="white"/>
+          <w:rtl w:val="0"/>
+        </w:rPr>
+        <w:t xml:space="preserve">https://github.com/niss10/IS-733-Data-Mining/blob/IS-733-HW2/HW2/Nisarg_Patel_HW2.ipynb</w:t>
       </w:r>
     </w:p>
     <w:p>

</xml_diff>